<commit_message>
feat(juntas-curso): homologacion de custodia fisica, archivo institucional y firmas duales
</commit_message>
<xml_diff>
--- a/templates/INFORME_JUNTAS_CURSO_TEMPLATE.docx
+++ b/templates/INFORME_JUNTAS_CURSO_TEMPLATE.docx
@@ -3701,7 +3701,7 @@
               <w:rPr>
                 <w:rFonts w:ascii="Times New Roman" w:hAnsi="Times New Roman"/>
               </w:rPr>
-              <w:t xml:space="preserve"/>
+              <w:t xml:space="preserve">{firma_elaborado}</w:t>
             </w:r>
           </w:p>
           <w:p>
@@ -4071,7 +4071,7 @@
               <w:rPr>
                 <w:rFonts w:ascii="Times New Roman" w:hAnsi="Times New Roman"/>
               </w:rPr>
-              <w:t xml:space="preserve"/>
+              <w:t xml:space="preserve">{firma_revisado}</w:t>
             </w:r>
           </w:p>
           <w:p>
@@ -4431,7 +4431,7 @@
               <w:rPr>
                 <w:rFonts w:ascii="Times New Roman" w:hAnsi="Times New Roman"/>
               </w:rPr>
-              <w:t xml:space="preserve"/>
+              <w:t xml:space="preserve">{firma_aprobado}</w:t>
             </w:r>
           </w:p>
           <w:p>
@@ -4507,6 +4507,19 @@
         </w:tc>
       </w:tr>
     </w:tbl>
+    <w:p>
+      <w:pPr>
+        <w:jc w:val="both"/>
+        <w:spacing w:before="200" w:after="100"/>
+      </w:pPr>
+      <w:r>
+        <w:rPr>
+          <w:rFonts w:ascii="Times New Roman" w:hAnsi="Times New Roman"/>
+          <w:sz w:val="19"/>
+        </w:rPr>
+        <w:t xml:space="preserve">{custodia_callout}</w:t>
+      </w:r>
+    </w:p>
     <w:sectPr>
       <w:headerReference w:type="default" r:id="rId5"/>
       <w:footerReference w:type="default" r:id="rId6"/>

</xml_diff>